<commit_message>
docs: operator and admin manuals cover v2.0 sign-in, lockout, language, time zone, HTTPS and signed updates
</commit_message>
<xml_diff>
--- a/docs/manuals/治具及模具管理系統＿操作人員說明書（中英）.docx
+++ b/docs/manuals/治具及模具管理系統＿操作人員說明書（中英）.docx
@@ -443,6 +443,70 @@
           <w:color w:val="0070C0"/>
         </w:rPr>
         <w:t>使用公用電腦後請務必登出。  |  Always log out when using a shared computer.</w:t>
+      </w:r>
+    </w:p>
+    <w:p>
+      <w:pPr>
+        <w:pStyle w:val="Heading2"/>
+      </w:pPr>
+      <w:r>
+        <w:t>2.3 第一次登入、密碼規則與鎖定  /  First Sign-in, Password Rules &amp; Lockout</w:t>
+      </w:r>
+    </w:p>
+    <w:p>
+      <w:pPr/>
+      <w:r>
+        <w:t>系統預設帳號為 admin、supervisor、engineer、operator，預設密碼都是 123456。第一次登入時，系統一定會先帶你到「修改密碼」頁，改好密碼才能使用其他功能。</w:t>
+      </w:r>
+    </w:p>
+    <w:p>
+      <w:pPr/>
+      <w:r>
+        <w:t>The default accounts are admin, supervisor, engineer and operator; the default password for all of them is 123456. On the first sign-in the system always opens the Change Password page first; the other pages are available after the password is changed.</w:t>
+      </w:r>
+    </w:p>
+    <w:p>
+      <w:pPr/>
+      <w:r>
+        <w:t>新密碼規則：8 到 50 個字元，不能和帳號相同，也不能是 12345678 這類常見密碼。從舊版更新上來的帳號，如果密碼不符合規則，下次登入時也會被要求修改。</w:t>
+      </w:r>
+    </w:p>
+    <w:p>
+      <w:pPr/>
+      <w:r>
+        <w:t>Password rules: 8 to 50 characters, not the same as the account name, and not a common password such as 12345678. After an update from an older version, accounts whose password breaks these rules are asked to change it at the next sign-in.</w:t>
+      </w:r>
+    </w:p>
+    <w:p>
+      <w:pPr/>
+      <w:r>
+        <w:t>連續輸入錯誤密碼 5 次，帳號會鎖定 15 分鐘。可以等 15 分鐘後再試，或請 Admin 解鎖。登入、登入失敗、鎖定與解鎖都會留下紀錄。</w:t>
+      </w:r>
+    </w:p>
+    <w:p>
+      <w:pPr/>
+      <w:r>
+        <w:t>After 5 wrong passwords in a row the account is locked for 15 minutes. Wait 15 minutes, or ask the Admin to unlock it. Sign-ins, failed sign-ins, lockouts and unlocks are all recorded.</w:t>
+      </w:r>
+    </w:p>
+    <w:p>
+      <w:pPr>
+        <w:pStyle w:val="Heading2"/>
+      </w:pPr>
+      <w:r>
+        <w:t>2.4 切換介面語言  /  Changing the Display Language</w:t>
+      </w:r>
+    </w:p>
+    <w:p>
+      <w:pPr/>
+      <w:r>
+        <w:t>登入頁和主要頁面上方有「語言」選單，可選 English、繁體中文、简体中文，按「套用」後立即切換。登入後選的語言會記在你的帳號，下次登入自動使用。</w:t>
+      </w:r>
+    </w:p>
+    <w:p>
+      <w:pPr/>
+      <w:r>
+        <w:t>The Language menu is on the sign-in page and at the top of the main pages: English, 繁體中文 or 简体中文. Click Apply to switch. After you sign in, your choice is saved with your account and used the next time.</w:t>
       </w:r>
     </w:p>
     <w:p>
@@ -2534,6 +2598,18 @@
       </w:r>
     </w:p>
     <w:p>
+      <w:pPr/>
+      <w:r>
+        <w:t>新密碼規則：8 到 50 個字元，不能和帳號相同，也不能是 12345678 這類常見密碼。從舊版更新上來的帳號，如果密碼不符合規則，下次登入時也會被要求修改。</w:t>
+      </w:r>
+    </w:p>
+    <w:p>
+      <w:pPr/>
+      <w:r>
+        <w:t>Password rules: 8 to 50 characters, not the same as the account name, and not a common password such as 12345678. After an update from an older version, accounts whose password breaks these rules are asked to change it at the next sign-in.</w:t>
+      </w:r>
+    </w:p>
+    <w:p>
       <w:pPr>
         <w:pStyle w:val="Heading1"/>
       </w:pPr>
@@ -2777,6 +2853,68 @@
               <w:t>確認已連上公司網路並使用正確網址，如仍無法連線請聯絡管理員。</w:t>
               <w:br/>
               <w:t>Check your network connection and URL. If issues persist, contact your admin.</w:t>
+            </w:r>
+          </w:p>
+        </w:tc>
+      </w:tr>
+      <w:tr>
+        <w:tc>
+          <w:tcPr>
+            <w:tcW w:type="dxa" w:w="2268"/>
+          </w:tcPr>
+          <w:p>
+            <w:r>
+              <w:rPr>
+                <w:sz w:val="20"/>
+              </w:rPr>
+              <w:t>帳號被鎖定怎麼辦？ My account is locked.</w:t>
+            </w:r>
+          </w:p>
+        </w:tc>
+        <w:tc>
+          <w:tcPr>
+            <w:tcW w:type="dxa" w:w="5669"/>
+          </w:tcPr>
+          <w:p>
+            <w:r>
+              <w:rPr>
+                <w:sz w:val="20"/>
+              </w:rPr>
+              <w:t>等 15 分鐘後再試，或請 Admin 在「使用者管理」按「解鎖」。</w:t>
+              <w:br/>
+              <w:t>Wait 15 minutes, or ask the Admin to click Unlock in User Management.</w:t>
+            </w:r>
+          </w:p>
+        </w:tc>
+      </w:tr>
+      <w:tr>
+        <w:tc>
+          <w:tcPr>
+            <w:tcW w:type="dxa" w:w="2268"/>
+            <w:shd w:val="clear" w:color="auto" w:fill="D9E1F2"/>
+          </w:tcPr>
+          <w:p>
+            <w:r>
+              <w:rPr>
+                <w:sz w:val="20"/>
+              </w:rPr>
+              <w:t>畫面語言不是我要的？ The screen is in the wrong language.</w:t>
+            </w:r>
+          </w:p>
+        </w:tc>
+        <w:tc>
+          <w:tcPr>
+            <w:tcW w:type="dxa" w:w="5669"/>
+            <w:shd w:val="clear" w:color="auto" w:fill="D9E1F2"/>
+          </w:tcPr>
+          <w:p>
+            <w:r>
+              <w:rPr>
+                <w:sz w:val="20"/>
+              </w:rPr>
+              <w:t>用畫面上方的「語言」選單切換，按「套用」。</w:t>
+              <w:br/>
+              <w:t>Choose a language in the Language menu at the top and click Apply.</w:t>
             </w:r>
           </w:p>
         </w:tc>

</xml_diff>